<commit_message>
build: update JMIR submission archive with italics formatting
All files refreshed after bold-to-italics conversion, build script
fixes, and submission checklist updates.

Refs #506

Co-Authored-By: Claude Opus 4.6 (1M context) <noreply@anthropic.com>
</commit_message>
<xml_diff>
--- a/ARCHIVED/20260329_JMIR-Submission/multimedia_appendix_1.docx
+++ b/ARCHIVED/20260329_JMIR-Submission/multimedia_appendix_1.docx
@@ -82,8 +82,8 @@
       </w:r>
       <w:r>
         <w:rPr>
-          <w:b/>
-          <w:bCs/>
+          <w:i/>
+          <w:iCs/>
         </w:rPr>
         <w:t xml:space="preserve">Natural Language Intent</w:t>
       </w:r>
@@ -95,8 +95,8 @@
       </w:r>
       <w:r>
         <w:rPr>
-          <w:b/>
-          <w:bCs/>
+          <w:i/>
+          <w:iCs/>
         </w:rPr>
         <w:t xml:space="preserve">Executable SQL</w:t>
       </w:r>
@@ -108,8 +108,8 @@
       </w:r>
       <w:r>
         <w:rPr>
-          <w:b/>
-          <w:bCs/>
+          <w:i/>
+          <w:iCs/>
         </w:rPr>
         <w:t xml:space="preserve">Rationale Metadata</w:t>
       </w:r>
@@ -183,8 +183,8 @@
       </w:pPr>
       <w:r>
         <w:rPr>
-          <w:b/>
-          <w:bCs/>
+          <w:i/>
+          <w:iCs/>
         </w:rPr>
         <w:t xml:space="preserve">Natural Language Intent:</w:t>
       </w:r>
@@ -201,8 +201,8 @@
       </w:pPr>
       <w:r>
         <w:rPr>
-          <w:b/>
-          <w:bCs/>
+          <w:i/>
+          <w:iCs/>
         </w:rPr>
         <w:t xml:space="preserve">Executable SQL:</w:t>
       </w:r>
@@ -527,8 +527,8 @@
       </w:pPr>
       <w:r>
         <w:rPr>
-          <w:b/>
-          <w:bCs/>
+          <w:i/>
+          <w:iCs/>
         </w:rPr>
         <w:t xml:space="preserve">Rationale Metadata:</w:t>
       </w:r>
@@ -562,8 +562,8 @@
       </w:pPr>
       <w:r>
         <w:rPr>
-          <w:b/>
-          <w:bCs/>
+          <w:i/>
+          <w:iCs/>
         </w:rPr>
         <w:t xml:space="preserve">Natural Language Intent:</w:t>
       </w:r>
@@ -580,8 +580,8 @@
       </w:pPr>
       <w:r>
         <w:rPr>
-          <w:b/>
-          <w:bCs/>
+          <w:i/>
+          <w:iCs/>
         </w:rPr>
         <w:t xml:space="preserve">Executable SQL:</w:t>
       </w:r>
@@ -1560,8 +1560,8 @@
       </w:pPr>
       <w:r>
         <w:rPr>
-          <w:b/>
-          <w:bCs/>
+          <w:i/>
+          <w:iCs/>
         </w:rPr>
         <w:t xml:space="preserve">Rationale Metadata:</w:t>
       </w:r>
@@ -1604,8 +1604,8 @@
       </w:pPr>
       <w:r>
         <w:rPr>
-          <w:b/>
-          <w:bCs/>
+          <w:i/>
+          <w:iCs/>
         </w:rPr>
         <w:t xml:space="preserve">Natural Language Intent:</w:t>
       </w:r>
@@ -1622,8 +1622,8 @@
       </w:pPr>
       <w:r>
         <w:rPr>
-          <w:b/>
-          <w:bCs/>
+          <w:i/>
+          <w:iCs/>
         </w:rPr>
         <w:t xml:space="preserve">Executable SQL:</w:t>
       </w:r>
@@ -2005,8 +2005,8 @@
       </w:pPr>
       <w:r>
         <w:rPr>
-          <w:b/>
-          <w:bCs/>
+          <w:i/>
+          <w:iCs/>
         </w:rPr>
         <w:t xml:space="preserve">Rationale Metadata:</w:t>
       </w:r>

</xml_diff>